<commit_message>
Add diagrams to coursework note
</commit_message>
<xml_diff>
--- a/docs/coursework-explanatory-note.docx
+++ b/docs/coursework-explanatory-note.docx
@@ -1307,6 +1307,63 @@
     </w:p>
     <w:p>
       <w:pPr>
+        <w:jc w:val="center"/>
+        <w:spacing w:before="120" w:after="80"/>
+      </w:pPr>
+      <w:r>
+        <w:drawing>
+          <wp:inline xmlns:wp="http://schemas.openxmlformats.org/drawingml/2006/wordprocessingDrawing" distT="0" distB="0" distL="0" distR="0">
+            <wp:extent cx="5580000" cy="632075"/>
+            <wp:docPr id="1" name="component-architecture.png"/>
+            <wp:cNvGraphicFramePr>
+              <a:graphicFrameLocks xmlns:a="http://schemas.openxmlformats.org/drawingml/2006/main" noChangeAspect="1"/>
+            </wp:cNvGraphicFramePr>
+            <a:graphic xmlns:a="http://schemas.openxmlformats.org/drawingml/2006/main">
+              <a:graphicData uri="http://schemas.openxmlformats.org/drawingml/2006/picture">
+                <pic:pic xmlns:pic="http://schemas.openxmlformats.org/drawingml/2006/picture">
+                  <pic:nvPicPr>
+                    <pic:cNvPr id="1" name="component-architecture.png"/>
+                    <pic:cNvPicPr/>
+                  </pic:nvPicPr>
+                  <pic:blipFill>
+                    <a:blip xmlns:r="http://schemas.openxmlformats.org/officeDocument/2006/relationships" r:embed="rIdImage1"/>
+                    <a:stretch>
+                      <a:fillRect/>
+                    </a:stretch>
+                  </pic:blipFill>
+                  <pic:spPr>
+                    <a:xfrm>
+                      <a:off x="0" y="0"/>
+                      <a:ext cx="5580000" cy="632075"/>
+                    </a:xfrm>
+                    <a:prstGeom prst="rect">
+                      <a:avLst/>
+                    </a:prstGeom>
+                  </pic:spPr>
+                </pic:pic>
+              </a:graphicData>
+            </a:graphic>
+          </wp:inline>
+        </w:drawing>
+      </w:r>
+    </w:p>
+    <w:p>
+      <w:pPr>
+        <w:jc w:val="center"/>
+        <w:spacing w:before="120" w:after="120" w:line="360" w:lineRule="auto"/>
+        <w:ind w:firstLine="0" w:left="0"/>
+      </w:pPr>
+      <w:r>
+        <w:rPr>
+          <w:rFonts w:ascii="Times New Roman" w:hAnsi="Times New Roman" w:cs="Times New Roman"/>
+          <w:sz w:val="28"/>
+          <w:szCs w:val="28"/>
+        </w:rPr>
+        <w:t xml:space="preserve">Рисунок 3.1 — Компонентная архитектура IaC-инструмента</w:t>
+      </w:r>
+    </w:p>
+    <w:p>
+      <w:pPr>
         <w:jc w:val="left"/>
         <w:spacing w:before="240" w:after="120" w:line="360" w:lineRule="auto"/>
         <w:ind w:firstLine="0" w:left="0"/>
@@ -1354,6 +1411,120 @@
     </w:p>
     <w:p>
       <w:pPr>
+        <w:jc w:val="center"/>
+        <w:spacing w:before="120" w:after="80"/>
+      </w:pPr>
+      <w:r>
+        <w:drawing>
+          <wp:inline xmlns:wp="http://schemas.openxmlformats.org/drawingml/2006/wordprocessingDrawing" distT="0" distB="0" distL="0" distR="0">
+            <wp:extent cx="4860000" cy="2856156"/>
+            <wp:docPr id="2" name="resource-dependency-graph.png"/>
+            <wp:cNvGraphicFramePr>
+              <a:graphicFrameLocks xmlns:a="http://schemas.openxmlformats.org/drawingml/2006/main" noChangeAspect="1"/>
+            </wp:cNvGraphicFramePr>
+            <a:graphic xmlns:a="http://schemas.openxmlformats.org/drawingml/2006/main">
+              <a:graphicData uri="http://schemas.openxmlformats.org/drawingml/2006/picture">
+                <pic:pic xmlns:pic="http://schemas.openxmlformats.org/drawingml/2006/picture">
+                  <pic:nvPicPr>
+                    <pic:cNvPr id="2" name="resource-dependency-graph.png"/>
+                    <pic:cNvPicPr/>
+                  </pic:nvPicPr>
+                  <pic:blipFill>
+                    <a:blip xmlns:r="http://schemas.openxmlformats.org/officeDocument/2006/relationships" r:embed="rIdImage2"/>
+                    <a:stretch>
+                      <a:fillRect/>
+                    </a:stretch>
+                  </pic:blipFill>
+                  <pic:spPr>
+                    <a:xfrm>
+                      <a:off x="0" y="0"/>
+                      <a:ext cx="4860000" cy="2856156"/>
+                    </a:xfrm>
+                    <a:prstGeom prst="rect">
+                      <a:avLst/>
+                    </a:prstGeom>
+                  </pic:spPr>
+                </pic:pic>
+              </a:graphicData>
+            </a:graphic>
+          </wp:inline>
+        </w:drawing>
+      </w:r>
+    </w:p>
+    <w:p>
+      <w:pPr>
+        <w:jc w:val="center"/>
+        <w:spacing w:before="120" w:after="120" w:line="360" w:lineRule="auto"/>
+        <w:ind w:firstLine="0" w:left="0"/>
+      </w:pPr>
+      <w:r>
+        <w:rPr>
+          <w:rFonts w:ascii="Times New Roman" w:hAnsi="Times New Roman" w:cs="Times New Roman"/>
+          <w:sz w:val="28"/>
+          <w:szCs w:val="28"/>
+        </w:rPr>
+        <w:t xml:space="preserve">Рисунок 3.2 — Граф зависимостей ресурсов демонстрационного манифеста</w:t>
+      </w:r>
+    </w:p>
+    <w:p>
+      <w:pPr>
+        <w:jc w:val="center"/>
+        <w:spacing w:before="120" w:after="80"/>
+      </w:pPr>
+      <w:r>
+        <w:drawing>
+          <wp:inline xmlns:wp="http://schemas.openxmlformats.org/drawingml/2006/wordprocessingDrawing" distT="0" distB="0" distL="0" distR="0">
+            <wp:extent cx="5580000" cy="1772027"/>
+            <wp:docPr id="3" name="state-manifest-cloud.png"/>
+            <wp:cNvGraphicFramePr>
+              <a:graphicFrameLocks xmlns:a="http://schemas.openxmlformats.org/drawingml/2006/main" noChangeAspect="1"/>
+            </wp:cNvGraphicFramePr>
+            <a:graphic xmlns:a="http://schemas.openxmlformats.org/drawingml/2006/main">
+              <a:graphicData uri="http://schemas.openxmlformats.org/drawingml/2006/picture">
+                <pic:pic xmlns:pic="http://schemas.openxmlformats.org/drawingml/2006/picture">
+                  <pic:nvPicPr>
+                    <pic:cNvPr id="3" name="state-manifest-cloud.png"/>
+                    <pic:cNvPicPr/>
+                  </pic:nvPicPr>
+                  <pic:blipFill>
+                    <a:blip xmlns:r="http://schemas.openxmlformats.org/officeDocument/2006/relationships" r:embed="rIdImage3"/>
+                    <a:stretch>
+                      <a:fillRect/>
+                    </a:stretch>
+                  </pic:blipFill>
+                  <pic:spPr>
+                    <a:xfrm>
+                      <a:off x="0" y="0"/>
+                      <a:ext cx="5580000" cy="1772027"/>
+                    </a:xfrm>
+                    <a:prstGeom prst="rect">
+                      <a:avLst/>
+                    </a:prstGeom>
+                  </pic:spPr>
+                </pic:pic>
+              </a:graphicData>
+            </a:graphic>
+          </wp:inline>
+        </w:drawing>
+      </w:r>
+    </w:p>
+    <w:p>
+      <w:pPr>
+        <w:jc w:val="center"/>
+        <w:spacing w:before="120" w:after="120" w:line="360" w:lineRule="auto"/>
+        <w:ind w:firstLine="0" w:left="0"/>
+      </w:pPr>
+      <w:r>
+        <w:rPr>
+          <w:rFonts w:ascii="Times New Roman" w:hAnsi="Times New Roman" w:cs="Times New Roman"/>
+          <w:sz w:val="28"/>
+          <w:szCs w:val="28"/>
+        </w:rPr>
+        <w:t xml:space="preserve">Рисунок 3.3 — Связь манифеста, локального состояния и реального облака</w:t>
+      </w:r>
+    </w:p>
+    <w:p>
+      <w:pPr>
         <w:jc w:val="left"/>
         <w:spacing w:before="360" w:after="180" w:line="360" w:lineRule="auto"/>
         <w:ind w:firstLine="0" w:left="0"/>
@@ -1607,6 +1778,63 @@
           <w:szCs w:val="28"/>
         </w:rPr>
         <w:t xml:space="preserve">Важной частью реализации стала поддержка безопасных updates. Первоначально MVP предполагал create, delete и replace. Затем была добавлена возможность обновлять некоторые поля без пересоздания. Это потребовало расширить state полем config_payload. На практике выяснилось, что не все поля, формально присутствующие в UpdateRequest SDK, можно безопасно менять в работающей инфраструктуре. Поэтому политика update/replace была уточнена на основе реальных ошибок Yandex Cloud.</w:t>
+      </w:r>
+    </w:p>
+    <w:p>
+      <w:pPr>
+        <w:jc w:val="center"/>
+        <w:spacing w:before="120" w:after="80"/>
+      </w:pPr>
+      <w:r>
+        <w:drawing>
+          <wp:inline xmlns:wp="http://schemas.openxmlformats.org/drawingml/2006/wordprocessingDrawing" distT="0" distB="0" distL="0" distR="0">
+            <wp:extent cx="4860000" cy="9371936"/>
+            <wp:docPr id="4" name="apply-sequence.png"/>
+            <wp:cNvGraphicFramePr>
+              <a:graphicFrameLocks xmlns:a="http://schemas.openxmlformats.org/drawingml/2006/main" noChangeAspect="1"/>
+            </wp:cNvGraphicFramePr>
+            <a:graphic xmlns:a="http://schemas.openxmlformats.org/drawingml/2006/main">
+              <a:graphicData uri="http://schemas.openxmlformats.org/drawingml/2006/picture">
+                <pic:pic xmlns:pic="http://schemas.openxmlformats.org/drawingml/2006/picture">
+                  <pic:nvPicPr>
+                    <pic:cNvPr id="4" name="apply-sequence.png"/>
+                    <pic:cNvPicPr/>
+                  </pic:nvPicPr>
+                  <pic:blipFill>
+                    <a:blip xmlns:r="http://schemas.openxmlformats.org/officeDocument/2006/relationships" r:embed="rIdImage4"/>
+                    <a:stretch>
+                      <a:fillRect/>
+                    </a:stretch>
+                  </pic:blipFill>
+                  <pic:spPr>
+                    <a:xfrm>
+                      <a:off x="0" y="0"/>
+                      <a:ext cx="4860000" cy="9371936"/>
+                    </a:xfrm>
+                    <a:prstGeom prst="rect">
+                      <a:avLst/>
+                    </a:prstGeom>
+                  </pic:spPr>
+                </pic:pic>
+              </a:graphicData>
+            </a:graphic>
+          </wp:inline>
+        </w:drawing>
+      </w:r>
+    </w:p>
+    <w:p>
+      <w:pPr>
+        <w:jc w:val="center"/>
+        <w:spacing w:before="120" w:after="120" w:line="360" w:lineRule="auto"/>
+        <w:ind w:firstLine="0" w:left="0"/>
+      </w:pPr>
+      <w:r>
+        <w:rPr>
+          <w:rFonts w:ascii="Times New Roman" w:hAnsi="Times New Roman" w:cs="Times New Roman"/>
+          <w:sz w:val="28"/>
+          <w:szCs w:val="28"/>
+        </w:rPr>
+        <w:t xml:space="preserve">Рисунок 4.1 — Последовательность выполнения команды apply</w:t>
       </w:r>
     </w:p>
     <w:p>

</xml_diff>

<commit_message>
Add contextual code listings to coursework note
</commit_message>
<xml_diff>
--- a/docs/coursework-explanatory-note.docx
+++ b/docs/coursework-explanatory-note.docx
@@ -1525,6 +1525,404 @@
     </w:p>
     <w:p>
       <w:pPr>
+        <w:jc w:val="both"/>
+        <w:spacing w:before="0" w:after="80" w:line="360" w:lineRule="auto"/>
+        <w:ind w:firstLine="709" w:left="0"/>
+      </w:pPr>
+      <w:r>
+        <w:rPr>
+          <w:rFonts w:ascii="Times New Roman" w:hAnsi="Times New Roman" w:cs="Times New Roman"/>
+          <w:sz w:val="28"/>
+          <w:szCs w:val="28"/>
+        </w:rPr>
+        <w:t xml:space="preserve">Структура локального состояния является центральным элементом проектирования. В листинге 3.1 показано, что state хранит не только идентификатор ресурса в облаке, но и зависимости, hash и payload последней примененной конфигурации. Благодаря этому планировщик может принимать решение о типе изменения без обращения к облаку.</w:t>
+      </w:r>
+    </w:p>
+    <w:p>
+      <w:pPr>
+        <w:jc w:val="center"/>
+        <w:spacing w:before="120" w:after="120" w:line="360" w:lineRule="auto"/>
+        <w:ind w:firstLine="0" w:left="0"/>
+      </w:pPr>
+      <w:r>
+        <w:rPr>
+          <w:rFonts w:ascii="Times New Roman" w:hAnsi="Times New Roman" w:cs="Times New Roman"/>
+          <w:sz w:val="28"/>
+          <w:szCs w:val="28"/>
+        </w:rPr>
+        <w:t xml:space="preserve">Листинг 3.1 — Модель состояния управляемого ресурса</w:t>
+      </w:r>
+    </w:p>
+    <w:p>
+      <w:pPr>
+        <w:spacing w:before="0" w:after="0" w:line="240" w:lineRule="auto"/>
+        <w:ind w:firstLine="0" w:left="0"/>
+      </w:pPr>
+      <w:r>
+        <w:rPr>
+          <w:rFonts w:ascii="Courier New" w:hAnsi="Courier New" w:cs="Courier New"/>
+          <w:sz w:val="18"/>
+          <w:szCs w:val="18"/>
+        </w:rPr>
+        <w:t xml:space="preserve">class ResourceState(BaseModel):</w:t>
+      </w:r>
+    </w:p>
+    <w:p>
+      <w:pPr>
+        <w:spacing w:before="0" w:after="0" w:line="240" w:lineRule="auto"/>
+        <w:ind w:firstLine="0" w:left="0"/>
+      </w:pPr>
+      <w:r>
+        <w:rPr>
+          <w:rFonts w:ascii="Courier New" w:hAnsi="Courier New" w:cs="Courier New"/>
+          <w:sz w:val="18"/>
+          <w:szCs w:val="18"/>
+        </w:rPr>
+        <w:t xml:space="preserve">    model_config = ConfigDict(extra="forbid")</w:t>
+      </w:r>
+    </w:p>
+    <w:p/>
+    <w:p>
+      <w:pPr>
+        <w:spacing w:before="0" w:after="0" w:line="240" w:lineRule="auto"/>
+        <w:ind w:firstLine="0" w:left="0"/>
+      </w:pPr>
+      <w:r>
+        <w:rPr>
+          <w:rFonts w:ascii="Courier New" w:hAnsi="Courier New" w:cs="Courier New"/>
+          <w:sz w:val="18"/>
+          <w:szCs w:val="18"/>
+        </w:rPr>
+        <w:t xml:space="preserve">    logical_name: str</w:t>
+      </w:r>
+    </w:p>
+    <w:p>
+      <w:pPr>
+        <w:spacing w:before="0" w:after="0" w:line="240" w:lineRule="auto"/>
+        <w:ind w:firstLine="0" w:left="0"/>
+      </w:pPr>
+      <w:r>
+        <w:rPr>
+          <w:rFonts w:ascii="Courier New" w:hAnsi="Courier New" w:cs="Courier New"/>
+          <w:sz w:val="18"/>
+          <w:szCs w:val="18"/>
+        </w:rPr>
+        <w:t xml:space="preserve">    resource_type: str</w:t>
+      </w:r>
+    </w:p>
+    <w:p>
+      <w:pPr>
+        <w:spacing w:before="0" w:after="0" w:line="240" w:lineRule="auto"/>
+        <w:ind w:firstLine="0" w:left="0"/>
+      </w:pPr>
+      <w:r>
+        <w:rPr>
+          <w:rFonts w:ascii="Courier New" w:hAnsi="Courier New" w:cs="Courier New"/>
+          <w:sz w:val="18"/>
+          <w:szCs w:val="18"/>
+        </w:rPr>
+        <w:t xml:space="preserve">    resource_id: str</w:t>
+      </w:r>
+    </w:p>
+    <w:p>
+      <w:pPr>
+        <w:spacing w:before="0" w:after="0" w:line="240" w:lineRule="auto"/>
+        <w:ind w:firstLine="0" w:left="0"/>
+      </w:pPr>
+      <w:r>
+        <w:rPr>
+          <w:rFonts w:ascii="Courier New" w:hAnsi="Courier New" w:cs="Courier New"/>
+          <w:sz w:val="18"/>
+          <w:szCs w:val="18"/>
+        </w:rPr>
+        <w:t xml:space="preserve">    config_hash: str</w:t>
+      </w:r>
+    </w:p>
+    <w:p>
+      <w:pPr>
+        <w:spacing w:before="0" w:after="0" w:line="240" w:lineRule="auto"/>
+        <w:ind w:firstLine="0" w:left="0"/>
+      </w:pPr>
+      <w:r>
+        <w:rPr>
+          <w:rFonts w:ascii="Courier New" w:hAnsi="Courier New" w:cs="Courier New"/>
+          <w:sz w:val="18"/>
+          <w:szCs w:val="18"/>
+        </w:rPr>
+        <w:t xml:space="preserve">    config_payload: dict[str, Any] = Field(default_factory=dict)</w:t>
+      </w:r>
+    </w:p>
+    <w:p>
+      <w:pPr>
+        <w:spacing w:before="0" w:after="0" w:line="240" w:lineRule="auto"/>
+        <w:ind w:firstLine="0" w:left="0"/>
+      </w:pPr>
+      <w:r>
+        <w:rPr>
+          <w:rFonts w:ascii="Courier New" w:hAnsi="Courier New" w:cs="Courier New"/>
+          <w:sz w:val="18"/>
+          <w:szCs w:val="18"/>
+        </w:rPr>
+        <w:t xml:space="preserve">    dependencies: list[str] = Field(default_factory=list)</w:t>
+      </w:r>
+    </w:p>
+    <w:p>
+      <w:pPr>
+        <w:spacing w:before="0" w:after="0" w:line="240" w:lineRule="auto"/>
+        <w:ind w:firstLine="0" w:left="0"/>
+      </w:pPr>
+      <w:r>
+        <w:rPr>
+          <w:rFonts w:ascii="Courier New" w:hAnsi="Courier New" w:cs="Courier New"/>
+          <w:sz w:val="18"/>
+          <w:szCs w:val="18"/>
+        </w:rPr>
+        <w:t xml:space="preserve">    metadata: dict[str, str] = Field(default_factory=dict)</w:t>
+      </w:r>
+    </w:p>
+    <w:p>
+      <w:pPr>
+        <w:jc w:val="both"/>
+        <w:spacing w:before="0" w:after="80" w:line="360" w:lineRule="auto"/>
+        <w:ind w:firstLine="709" w:left="0"/>
+      </w:pPr>
+      <w:r>
+        <w:rPr>
+          <w:rFonts w:ascii="Times New Roman" w:hAnsi="Times New Roman" w:cs="Times New Roman"/>
+          <w:sz w:val="28"/>
+          <w:szCs w:val="28"/>
+        </w:rPr>
+        <w:t xml:space="preserve">Решение о возможности обновления на месте вынесено в базовый обработчик ресурса. Листинг 3.2 показывает общий механизм: сравниваются старый и новый payload, после чего проверяется, входят ли измененные поля в множество updatable_fields конкретного ресурса.</w:t>
+      </w:r>
+    </w:p>
+    <w:p>
+      <w:pPr>
+        <w:jc w:val="center"/>
+        <w:spacing w:before="120" w:after="120" w:line="360" w:lineRule="auto"/>
+        <w:ind w:firstLine="0" w:left="0"/>
+      </w:pPr>
+      <w:r>
+        <w:rPr>
+          <w:rFonts w:ascii="Times New Roman" w:hAnsi="Times New Roman" w:cs="Times New Roman"/>
+          <w:sz w:val="28"/>
+          <w:szCs w:val="28"/>
+        </w:rPr>
+        <w:t xml:space="preserve">Листинг 3.2 — Общая проверка возможности update</w:t>
+      </w:r>
+    </w:p>
+    <w:p>
+      <w:pPr>
+        <w:spacing w:before="0" w:after="0" w:line="240" w:lineRule="auto"/>
+        <w:ind w:firstLine="0" w:left="0"/>
+      </w:pPr>
+      <w:r>
+        <w:rPr>
+          <w:rFonts w:ascii="Courier New" w:hAnsi="Courier New" w:cs="Courier New"/>
+          <w:sz w:val="18"/>
+          <w:szCs w:val="18"/>
+        </w:rPr>
+        <w:t xml:space="preserve">def changed_fields(self, resource: ResourceState) -&gt; set[str]:</w:t>
+      </w:r>
+    </w:p>
+    <w:p>
+      <w:pPr>
+        <w:spacing w:before="0" w:after="0" w:line="240" w:lineRule="auto"/>
+        <w:ind w:firstLine="0" w:left="0"/>
+      </w:pPr>
+      <w:r>
+        <w:rPr>
+          <w:rFonts w:ascii="Courier New" w:hAnsi="Courier New" w:cs="Courier New"/>
+          <w:sz w:val="18"/>
+          <w:szCs w:val="18"/>
+        </w:rPr>
+        <w:t xml:space="preserve">    old_payload = resource.config_payload</w:t>
+      </w:r>
+    </w:p>
+    <w:p>
+      <w:pPr>
+        <w:spacing w:before="0" w:after="0" w:line="240" w:lineRule="auto"/>
+        <w:ind w:firstLine="0" w:left="0"/>
+      </w:pPr>
+      <w:r>
+        <w:rPr>
+          <w:rFonts w:ascii="Courier New" w:hAnsi="Courier New" w:cs="Courier New"/>
+          <w:sz w:val="18"/>
+          <w:szCs w:val="18"/>
+        </w:rPr>
+        <w:t xml:space="preserve">    if not old_payload:</w:t>
+      </w:r>
+    </w:p>
+    <w:p>
+      <w:pPr>
+        <w:spacing w:before="0" w:after="0" w:line="240" w:lineRule="auto"/>
+        <w:ind w:firstLine="0" w:left="0"/>
+      </w:pPr>
+      <w:r>
+        <w:rPr>
+          <w:rFonts w:ascii="Courier New" w:hAnsi="Courier New" w:cs="Courier New"/>
+          <w:sz w:val="18"/>
+          <w:szCs w:val="18"/>
+        </w:rPr>
+        <w:t xml:space="preserve">        return set()</w:t>
+      </w:r>
+    </w:p>
+    <w:p>
+      <w:pPr>
+        <w:spacing w:before="0" w:after="0" w:line="240" w:lineRule="auto"/>
+        <w:ind w:firstLine="0" w:left="0"/>
+      </w:pPr>
+      <w:r>
+        <w:rPr>
+          <w:rFonts w:ascii="Courier New" w:hAnsi="Courier New" w:cs="Courier New"/>
+          <w:sz w:val="18"/>
+          <w:szCs w:val="18"/>
+        </w:rPr>
+        <w:t xml:space="preserve">    new_payload = self.fingerprint_payload()</w:t>
+      </w:r>
+    </w:p>
+    <w:p>
+      <w:pPr>
+        <w:spacing w:before="0" w:after="0" w:line="240" w:lineRule="auto"/>
+        <w:ind w:firstLine="0" w:left="0"/>
+      </w:pPr>
+      <w:r>
+        <w:rPr>
+          <w:rFonts w:ascii="Courier New" w:hAnsi="Courier New" w:cs="Courier New"/>
+          <w:sz w:val="18"/>
+          <w:szCs w:val="18"/>
+        </w:rPr>
+        <w:t xml:space="preserve">    return {</w:t>
+      </w:r>
+    </w:p>
+    <w:p>
+      <w:pPr>
+        <w:spacing w:before="0" w:after="0" w:line="240" w:lineRule="auto"/>
+        <w:ind w:firstLine="0" w:left="0"/>
+      </w:pPr>
+      <w:r>
+        <w:rPr>
+          <w:rFonts w:ascii="Courier New" w:hAnsi="Courier New" w:cs="Courier New"/>
+          <w:sz w:val="18"/>
+          <w:szCs w:val="18"/>
+        </w:rPr>
+        <w:t xml:space="preserve">        key</w:t>
+      </w:r>
+    </w:p>
+    <w:p>
+      <w:pPr>
+        <w:spacing w:before="0" w:after="0" w:line="240" w:lineRule="auto"/>
+        <w:ind w:firstLine="0" w:left="0"/>
+      </w:pPr>
+      <w:r>
+        <w:rPr>
+          <w:rFonts w:ascii="Courier New" w:hAnsi="Courier New" w:cs="Courier New"/>
+          <w:sz w:val="18"/>
+          <w:szCs w:val="18"/>
+        </w:rPr>
+        <w:t xml:space="preserve">        for key in old_payload.keys() | new_payload.keys()</w:t>
+      </w:r>
+    </w:p>
+    <w:p>
+      <w:pPr>
+        <w:spacing w:before="0" w:after="0" w:line="240" w:lineRule="auto"/>
+        <w:ind w:firstLine="0" w:left="0"/>
+      </w:pPr>
+      <w:r>
+        <w:rPr>
+          <w:rFonts w:ascii="Courier New" w:hAnsi="Courier New" w:cs="Courier New"/>
+          <w:sz w:val="18"/>
+          <w:szCs w:val="18"/>
+        </w:rPr>
+        <w:t xml:space="preserve">        if old_payload.get(key) != new_payload.get(key)</w:t>
+      </w:r>
+    </w:p>
+    <w:p>
+      <w:pPr>
+        <w:spacing w:before="0" w:after="0" w:line="240" w:lineRule="auto"/>
+        <w:ind w:firstLine="0" w:left="0"/>
+      </w:pPr>
+      <w:r>
+        <w:rPr>
+          <w:rFonts w:ascii="Courier New" w:hAnsi="Courier New" w:cs="Courier New"/>
+          <w:sz w:val="18"/>
+          <w:szCs w:val="18"/>
+        </w:rPr>
+        <w:t xml:space="preserve">    }</w:t>
+      </w:r>
+    </w:p>
+    <w:p/>
+    <w:p>
+      <w:pPr>
+        <w:spacing w:before="0" w:after="0" w:line="240" w:lineRule="auto"/>
+        <w:ind w:firstLine="0" w:left="0"/>
+      </w:pPr>
+      <w:r>
+        <w:rPr>
+          <w:rFonts w:ascii="Courier New" w:hAnsi="Courier New" w:cs="Courier New"/>
+          <w:sz w:val="18"/>
+          <w:szCs w:val="18"/>
+        </w:rPr>
+        <w:t xml:space="preserve">def can_update(self, resource: ResourceState) -&gt; bool:</w:t>
+      </w:r>
+    </w:p>
+    <w:p>
+      <w:pPr>
+        <w:spacing w:before="0" w:after="0" w:line="240" w:lineRule="auto"/>
+        <w:ind w:firstLine="0" w:left="0"/>
+      </w:pPr>
+      <w:r>
+        <w:rPr>
+          <w:rFonts w:ascii="Courier New" w:hAnsi="Courier New" w:cs="Courier New"/>
+          <w:sz w:val="18"/>
+          <w:szCs w:val="18"/>
+        </w:rPr>
+        <w:t xml:space="preserve">    if resource.resource_type != self.resource_type:</w:t>
+      </w:r>
+    </w:p>
+    <w:p>
+      <w:pPr>
+        <w:spacing w:before="0" w:after="0" w:line="240" w:lineRule="auto"/>
+        <w:ind w:firstLine="0" w:left="0"/>
+      </w:pPr>
+      <w:r>
+        <w:rPr>
+          <w:rFonts w:ascii="Courier New" w:hAnsi="Courier New" w:cs="Courier New"/>
+          <w:sz w:val="18"/>
+          <w:szCs w:val="18"/>
+        </w:rPr>
+        <w:t xml:space="preserve">        return False</w:t>
+      </w:r>
+    </w:p>
+    <w:p>
+      <w:pPr>
+        <w:spacing w:before="0" w:after="0" w:line="240" w:lineRule="auto"/>
+        <w:ind w:firstLine="0" w:left="0"/>
+      </w:pPr>
+      <w:r>
+        <w:rPr>
+          <w:rFonts w:ascii="Courier New" w:hAnsi="Courier New" w:cs="Courier New"/>
+          <w:sz w:val="18"/>
+          <w:szCs w:val="18"/>
+        </w:rPr>
+        <w:t xml:space="preserve">    changed = self.changed_fields(resource)</w:t>
+      </w:r>
+    </w:p>
+    <w:p>
+      <w:pPr>
+        <w:spacing w:before="0" w:after="0" w:line="240" w:lineRule="auto"/>
+        <w:ind w:firstLine="0" w:left="0"/>
+      </w:pPr>
+      <w:r>
+        <w:rPr>
+          <w:rFonts w:ascii="Courier New" w:hAnsi="Courier New" w:cs="Courier New"/>
+          <w:sz w:val="18"/>
+          <w:szCs w:val="18"/>
+        </w:rPr>
+        <w:t xml:space="preserve">    return bool(changed) and changed &lt;= self.updatable_fields</w:t>
+      </w:r>
+    </w:p>
+    <w:p>
+      <w:pPr>
         <w:jc w:val="left"/>
         <w:spacing w:before="360" w:after="180" w:line="360" w:lineRule="auto"/>
         <w:ind w:firstLine="0" w:left="0"/>
@@ -1835,6 +2233,347 @@
           <w:szCs w:val="28"/>
         </w:rPr>
         <w:t xml:space="preserve">Рисунок 4.1 — Последовательность выполнения команды apply</w:t>
+      </w:r>
+    </w:p>
+    <w:p>
+      <w:pPr>
+        <w:jc w:val="both"/>
+        <w:spacing w:before="0" w:after="80" w:line="360" w:lineRule="auto"/>
+        <w:ind w:firstLine="709" w:left="0"/>
+      </w:pPr>
+      <w:r>
+        <w:rPr>
+          <w:rFonts w:ascii="Times New Roman" w:hAnsi="Times New Roman" w:cs="Times New Roman"/>
+          <w:sz w:val="28"/>
+          <w:szCs w:val="28"/>
+        </w:rPr>
+        <w:t xml:space="preserve">Ключевой фрагмент планировщика приведен в листинге 4.1. Он показывает, как на основе state и текущего обработчика выбирается create, update, replace или noop. Этот код является ядром декларативного поведения инструмента.</w:t>
+      </w:r>
+    </w:p>
+    <w:p>
+      <w:pPr>
+        <w:jc w:val="center"/>
+        <w:spacing w:before="120" w:after="120" w:line="360" w:lineRule="auto"/>
+        <w:ind w:firstLine="0" w:left="0"/>
+      </w:pPr>
+      <w:r>
+        <w:rPr>
+          <w:rFonts w:ascii="Times New Roman" w:hAnsi="Times New Roman" w:cs="Times New Roman"/>
+          <w:sz w:val="28"/>
+          <w:szCs w:val="28"/>
+        </w:rPr>
+        <w:t xml:space="preserve">Листинг 4.1 — Выбор типа изменения в планировщике</w:t>
+      </w:r>
+    </w:p>
+    <w:p>
+      <w:pPr>
+        <w:spacing w:before="0" w:after="0" w:line="240" w:lineRule="auto"/>
+        <w:ind w:firstLine="0" w:left="0"/>
+      </w:pPr>
+      <w:r>
+        <w:rPr>
+          <w:rFonts w:ascii="Courier New" w:hAnsi="Courier New" w:cs="Courier New"/>
+          <w:sz w:val="18"/>
+          <w:szCs w:val="18"/>
+        </w:rPr>
+        <w:t xml:space="preserve">if current is None:</w:t>
+      </w:r>
+    </w:p>
+    <w:p>
+      <w:pPr>
+        <w:spacing w:before="0" w:after="0" w:line="240" w:lineRule="auto"/>
+        <w:ind w:firstLine="0" w:left="0"/>
+      </w:pPr>
+      <w:r>
+        <w:rPr>
+          <w:rFonts w:ascii="Courier New" w:hAnsi="Courier New" w:cs="Courier New"/>
+          <w:sz w:val="18"/>
+          <w:szCs w:val="18"/>
+        </w:rPr>
+        <w:t xml:space="preserve">    decisions[handler.logical_name] = ChangeKind.CREATE</w:t>
+      </w:r>
+    </w:p>
+    <w:p>
+      <w:pPr>
+        <w:spacing w:before="0" w:after="0" w:line="240" w:lineRule="auto"/>
+        <w:ind w:firstLine="0" w:left="0"/>
+      </w:pPr>
+      <w:r>
+        <w:rPr>
+          <w:rFonts w:ascii="Courier New" w:hAnsi="Courier New" w:cs="Courier New"/>
+          <w:sz w:val="18"/>
+          <w:szCs w:val="18"/>
+        </w:rPr>
+        <w:t xml:space="preserve">elif current.resource_type != handler.resource_type:</w:t>
+      </w:r>
+    </w:p>
+    <w:p>
+      <w:pPr>
+        <w:spacing w:before="0" w:after="0" w:line="240" w:lineRule="auto"/>
+        <w:ind w:firstLine="0" w:left="0"/>
+      </w:pPr>
+      <w:r>
+        <w:rPr>
+          <w:rFonts w:ascii="Courier New" w:hAnsi="Courier New" w:cs="Courier New"/>
+          <w:sz w:val="18"/>
+          <w:szCs w:val="18"/>
+        </w:rPr>
+        <w:t xml:space="preserve">    decisions[handler.logical_name] = ChangeKind.REPLACE</w:t>
+      </w:r>
+    </w:p>
+    <w:p>
+      <w:pPr>
+        <w:spacing w:before="0" w:after="0" w:line="240" w:lineRule="auto"/>
+        <w:ind w:firstLine="0" w:left="0"/>
+      </w:pPr>
+      <w:r>
+        <w:rPr>
+          <w:rFonts w:ascii="Courier New" w:hAnsi="Courier New" w:cs="Courier New"/>
+          <w:sz w:val="18"/>
+          <w:szCs w:val="18"/>
+        </w:rPr>
+        <w:t xml:space="preserve">elif current.config_hash != handler.config_hash() and handler.can_update(current):</w:t>
+      </w:r>
+    </w:p>
+    <w:p>
+      <w:pPr>
+        <w:spacing w:before="0" w:after="0" w:line="240" w:lineRule="auto"/>
+        <w:ind w:firstLine="0" w:left="0"/>
+      </w:pPr>
+      <w:r>
+        <w:rPr>
+          <w:rFonts w:ascii="Courier New" w:hAnsi="Courier New" w:cs="Courier New"/>
+          <w:sz w:val="18"/>
+          <w:szCs w:val="18"/>
+        </w:rPr>
+        <w:t xml:space="preserve">    decisions[handler.logical_name] = ChangeKind.UPDATE</w:t>
+      </w:r>
+    </w:p>
+    <w:p>
+      <w:pPr>
+        <w:spacing w:before="0" w:after="0" w:line="240" w:lineRule="auto"/>
+        <w:ind w:firstLine="0" w:left="0"/>
+      </w:pPr>
+      <w:r>
+        <w:rPr>
+          <w:rFonts w:ascii="Courier New" w:hAnsi="Courier New" w:cs="Courier New"/>
+          <w:sz w:val="18"/>
+          <w:szCs w:val="18"/>
+        </w:rPr>
+        <w:t xml:space="preserve">elif current.config_hash != handler.config_hash():</w:t>
+      </w:r>
+    </w:p>
+    <w:p>
+      <w:pPr>
+        <w:spacing w:before="0" w:after="0" w:line="240" w:lineRule="auto"/>
+        <w:ind w:firstLine="0" w:left="0"/>
+      </w:pPr>
+      <w:r>
+        <w:rPr>
+          <w:rFonts w:ascii="Courier New" w:hAnsi="Courier New" w:cs="Courier New"/>
+          <w:sz w:val="18"/>
+          <w:szCs w:val="18"/>
+        </w:rPr>
+        <w:t xml:space="preserve">    decisions[handler.logical_name] = ChangeKind.REPLACE</w:t>
+      </w:r>
+    </w:p>
+    <w:p>
+      <w:pPr>
+        <w:spacing w:before="0" w:after="0" w:line="240" w:lineRule="auto"/>
+        <w:ind w:firstLine="0" w:left="0"/>
+      </w:pPr>
+      <w:r>
+        <w:rPr>
+          <w:rFonts w:ascii="Courier New" w:hAnsi="Courier New" w:cs="Courier New"/>
+          <w:sz w:val="18"/>
+          <w:szCs w:val="18"/>
+        </w:rPr>
+        <w:t xml:space="preserve">else:</w:t>
+      </w:r>
+    </w:p>
+    <w:p>
+      <w:pPr>
+        <w:spacing w:before="0" w:after="0" w:line="240" w:lineRule="auto"/>
+        <w:ind w:firstLine="0" w:left="0"/>
+      </w:pPr>
+      <w:r>
+        <w:rPr>
+          <w:rFonts w:ascii="Courier New" w:hAnsi="Courier New" w:cs="Courier New"/>
+          <w:sz w:val="18"/>
+          <w:szCs w:val="18"/>
+        </w:rPr>
+        <w:t xml:space="preserve">    decisions[handler.logical_name] = ChangeKind.NOOP</w:t>
+      </w:r>
+    </w:p>
+    <w:p>
+      <w:pPr>
+        <w:jc w:val="both"/>
+        <w:spacing w:before="0" w:after="80" w:line="360" w:lineRule="auto"/>
+        <w:ind w:firstLine="709" w:left="0"/>
+      </w:pPr>
+      <w:r>
+        <w:rPr>
+          <w:rFonts w:ascii="Times New Roman" w:hAnsi="Times New Roman" w:cs="Times New Roman"/>
+          <w:sz w:val="28"/>
+          <w:szCs w:val="28"/>
+        </w:rPr>
+        <w:t xml:space="preserve">Выполнение плана построено по паттерну Command. Листинг 4.2 демонстрирует update-команду: она получает ресурс из state, вызывает полиморфный метод update у обработчика, затем сохраняет обновленное состояние.</w:t>
+      </w:r>
+    </w:p>
+    <w:p>
+      <w:pPr>
+        <w:jc w:val="center"/>
+        <w:spacing w:before="120" w:after="120" w:line="360" w:lineRule="auto"/>
+        <w:ind w:firstLine="0" w:left="0"/>
+      </w:pPr>
+      <w:r>
+        <w:rPr>
+          <w:rFonts w:ascii="Times New Roman" w:hAnsi="Times New Roman" w:cs="Times New Roman"/>
+          <w:sz w:val="28"/>
+          <w:szCs w:val="28"/>
+        </w:rPr>
+        <w:t xml:space="preserve">Листинг 4.2 — Команда обновления ресурса</w:t>
+      </w:r>
+    </w:p>
+    <w:p>
+      <w:pPr>
+        <w:spacing w:before="0" w:after="0" w:line="240" w:lineRule="auto"/>
+        <w:ind w:firstLine="0" w:left="0"/>
+      </w:pPr>
+      <w:r>
+        <w:rPr>
+          <w:rFonts w:ascii="Courier New" w:hAnsi="Courier New" w:cs="Courier New"/>
+          <w:sz w:val="18"/>
+          <w:szCs w:val="18"/>
+        </w:rPr>
+        <w:t xml:space="preserve">class UpdateResourceCommand(PlanCommand):</w:t>
+      </w:r>
+    </w:p>
+    <w:p>
+      <w:pPr>
+        <w:spacing w:before="0" w:after="0" w:line="240" w:lineRule="auto"/>
+        <w:ind w:firstLine="0" w:left="0"/>
+      </w:pPr>
+      <w:r>
+        <w:rPr>
+          <w:rFonts w:ascii="Courier New" w:hAnsi="Courier New" w:cs="Courier New"/>
+          <w:sz w:val="18"/>
+          <w:szCs w:val="18"/>
+        </w:rPr>
+        <w:t xml:space="preserve">    handler: CloudResourceHandler</w:t>
+      </w:r>
+    </w:p>
+    <w:p>
+      <w:pPr>
+        <w:spacing w:before="0" w:after="0" w:line="240" w:lineRule="auto"/>
+        <w:ind w:firstLine="0" w:left="0"/>
+      </w:pPr>
+      <w:r>
+        <w:rPr>
+          <w:rFonts w:ascii="Courier New" w:hAnsi="Courier New" w:cs="Courier New"/>
+          <w:sz w:val="18"/>
+          <w:szCs w:val="18"/>
+        </w:rPr>
+        <w:t xml:space="preserve">    reason: str</w:t>
+      </w:r>
+    </w:p>
+    <w:p/>
+    <w:p>
+      <w:pPr>
+        <w:spacing w:before="0" w:after="0" w:line="240" w:lineRule="auto"/>
+        <w:ind w:firstLine="0" w:left="0"/>
+      </w:pPr>
+      <w:r>
+        <w:rPr>
+          <w:rFonts w:ascii="Courier New" w:hAnsi="Courier New" w:cs="Courier New"/>
+          <w:sz w:val="18"/>
+          <w:szCs w:val="18"/>
+        </w:rPr>
+        <w:t xml:space="preserve">    def execute(self, facade, state, state_store) -&gt; None:</w:t>
+      </w:r>
+    </w:p>
+    <w:p>
+      <w:pPr>
+        <w:spacing w:before="0" w:after="0" w:line="240" w:lineRule="auto"/>
+        <w:ind w:firstLine="0" w:left="0"/>
+      </w:pPr>
+      <w:r>
+        <w:rPr>
+          <w:rFonts w:ascii="Courier New" w:hAnsi="Courier New" w:cs="Courier New"/>
+          <w:sz w:val="18"/>
+          <w:szCs w:val="18"/>
+        </w:rPr>
+        <w:t xml:space="preserve">        resource = state.get(self.handler.logical_name)</w:t>
+      </w:r>
+    </w:p>
+    <w:p>
+      <w:pPr>
+        <w:spacing w:before="0" w:after="0" w:line="240" w:lineRule="auto"/>
+        <w:ind w:firstLine="0" w:left="0"/>
+      </w:pPr>
+      <w:r>
+        <w:rPr>
+          <w:rFonts w:ascii="Courier New" w:hAnsi="Courier New" w:cs="Courier New"/>
+          <w:sz w:val="18"/>
+          <w:szCs w:val="18"/>
+        </w:rPr>
+        <w:t xml:space="preserve">        if resource is None:</w:t>
+      </w:r>
+    </w:p>
+    <w:p>
+      <w:pPr>
+        <w:spacing w:before="0" w:after="0" w:line="240" w:lineRule="auto"/>
+        <w:ind w:firstLine="0" w:left="0"/>
+      </w:pPr>
+      <w:r>
+        <w:rPr>
+          <w:rFonts w:ascii="Courier New" w:hAnsi="Courier New" w:cs="Courier New"/>
+          <w:sz w:val="18"/>
+          <w:szCs w:val="18"/>
+        </w:rPr>
+        <w:t xml:space="preserve">            raise ExecutionError(f"Resource '{self.logical_name}' is missing from state")</w:t>
+      </w:r>
+    </w:p>
+    <w:p>
+      <w:pPr>
+        <w:spacing w:before="0" w:after="0" w:line="240" w:lineRule="auto"/>
+        <w:ind w:firstLine="0" w:left="0"/>
+      </w:pPr>
+      <w:r>
+        <w:rPr>
+          <w:rFonts w:ascii="Courier New" w:hAnsi="Courier New" w:cs="Courier New"/>
+          <w:sz w:val="18"/>
+          <w:szCs w:val="18"/>
+        </w:rPr>
+        <w:t xml:space="preserve">        updated = self.handler.update(facade, state, resource)</w:t>
+      </w:r>
+    </w:p>
+    <w:p>
+      <w:pPr>
+        <w:spacing w:before="0" w:after="0" w:line="240" w:lineRule="auto"/>
+        <w:ind w:firstLine="0" w:left="0"/>
+      </w:pPr>
+      <w:r>
+        <w:rPr>
+          <w:rFonts w:ascii="Courier New" w:hAnsi="Courier New" w:cs="Courier New"/>
+          <w:sz w:val="18"/>
+          <w:szCs w:val="18"/>
+        </w:rPr>
+        <w:t xml:space="preserve">        state.put(updated)</w:t>
+      </w:r>
+    </w:p>
+    <w:p>
+      <w:pPr>
+        <w:spacing w:before="0" w:after="0" w:line="240" w:lineRule="auto"/>
+        <w:ind w:firstLine="0" w:left="0"/>
+      </w:pPr>
+      <w:r>
+        <w:rPr>
+          <w:rFonts w:ascii="Courier New" w:hAnsi="Courier New" w:cs="Courier New"/>
+          <w:sz w:val="18"/>
+          <w:szCs w:val="18"/>
+        </w:rPr>
+        <w:t xml:space="preserve">        state_store.save(state)</w:t>
       </w:r>
     </w:p>
     <w:p>

</xml_diff>